<commit_message>
Add write-up on using duplicate clips to create soft shadows in DaVinci Resolve
</commit_message>
<xml_diff>
--- a/Articles/2026/3_DaVinci_Tips_and_Tricks/Enlightenment Summer Article Ideas/12 Creating a Shadow.docx
+++ b/Articles/2026/3_DaVinci_Tips_and_Tricks/Enlightenment Summer Article Ideas/12 Creating a Shadow.docx
@@ -3,22 +3,30 @@
 <w:document xmlns:wpc="http://schemas.microsoft.com/office/word/2010/wordprocessingCanvas" xmlns:cx="http://schemas.microsoft.com/office/drawing/2014/chartex" xmlns:cx1="http://schemas.microsoft.com/office/drawing/2015/9/8/chartex" xmlns:cx2="http://schemas.microsoft.com/office/drawing/2015/10/21/chartex" xmlns:cx3="http://schemas.microsoft.com/office/drawing/2016/5/9/chartex" xmlns:cx4="http://schemas.microsoft.com/office/drawing/2016/5/10/chartex" xmlns:cx5="http://schemas.microsoft.com/office/drawing/2016/5/11/chartex" xmlns:cx6="http://schemas.microsoft.com/office/drawing/2016/5/12/chartex" xmlns:cx7="http://schemas.microsoft.com/office/drawing/2016/5/13/chartex" xmlns:cx8="http://schemas.microsoft.com/office/drawing/2016/5/14/chartex" xmlns:mc="http://schemas.openxmlformats.org/markup-compatibility/2006" xmlns:aink="http://schemas.microsoft.com/office/drawing/2016/ink" xmlns:am3d="http://schemas.microsoft.com/office/drawing/2017/model3d" xmlns:o="urn:schemas-microsoft-com:office:office" xmlns:oel="http://schemas.microsoft.com/office/2019/extlst" xmlns:r="http://schemas.openxmlformats.org/officeDocument/2006/relationships" xmlns:m="http://schemas.openxmlformats.org/officeDocument/2006/math" xmlns:v="urn:schemas-microsoft-com:vml" xmlns:wp14="http://schemas.microsoft.com/office/word/2010/wordprocessingDrawing" xmlns:wp="http://schemas.openxmlformats.org/drawingml/2006/wordprocessingDrawing" xmlns:w10="urn:schemas-microsoft-com:office:word" xmlns:w="http://schemas.openxmlformats.org/wordprocessingml/2006/main" xmlns:w14="http://schemas.microsoft.com/office/word/2010/wordml" xmlns:w15="http://schemas.microsoft.com/office/word/2012/wordml" xmlns:w16cex="http://schemas.microsoft.com/office/word/2018/wordml/cex" xmlns:w16cid="http://schemas.microsoft.com/office/word/2016/wordml/cid" xmlns:w16="http://schemas.microsoft.com/office/word/2018/wordml" xmlns:w16du="http://schemas.microsoft.com/office/word/2023/wordml/word16du" xmlns:w16sdtdh="http://schemas.microsoft.com/office/word/2020/wordml/sdtdatahash" xmlns:w16sdtfl="http://schemas.microsoft.com/office/word/2024/wordml/sdtformatlock" xmlns:w16se="http://schemas.microsoft.com/office/word/2015/wordml/symex" xmlns:wpg="http://schemas.microsoft.com/office/word/2010/wordprocessingGroup" xmlns:wpi="http://schemas.microsoft.com/office/word/2010/wordprocessingInk" xmlns:wne="http://schemas.microsoft.com/office/word/2006/wordml" xmlns:wps="http://schemas.microsoft.com/office/word/2010/wordprocessingShape" mc:Ignorable="w14 w15 w16se w16cid w16 w16cex w16sdtdh w16sdtfl w16du wp14">
   <w:body>
     <w:p>
-      <w:r>
-        <w:t>Creating a Shadow</w:t>
+      <w:pPr>
+        <w:pStyle w:val="Title"/>
+      </w:pPr>
+      <w:bookmarkStart w:id="0" w:name="_Hlk230863798"/>
+      <w:r>
+        <w:t xml:space="preserve">12 </w:t>
+      </w:r>
+      <w:r>
+        <w:t>Using Duplicate Clips to Make a Soft Shadow in DaVinci Resolve</w:t>
+      </w:r>
+    </w:p>
+    <w:bookmarkEnd w:id="0"/>
+    <w:p>
+      <w:r>
+        <w:t xml:space="preserve">Duplicate the track you want to add a shadow to, then pull it under the main track. </w:t>
       </w:r>
     </w:p>
     <w:p>
       <w:r>
-        <w:t xml:space="preserve">Duplicate the track you want to add a shadow to, then pull it under the main track. </w:t>
-      </w:r>
-    </w:p>
-    <w:p>
-      <w:r>
         <w:drawing>
-          <wp:inline distT="0" distB="0" distL="0" distR="0" wp14:anchorId="0D66CBC1" wp14:editId="199D8616">
-            <wp:extent cx="5943600" cy="2879090"/>
-            <wp:effectExtent l="76200" t="76200" r="133350" b="130810"/>
-            <wp:docPr id="1931260304" name="Picture 1"/>
+          <wp:inline distT="0" distB="0" distL="0" distR="0" wp14:anchorId="454C8484" wp14:editId="0F526698">
+            <wp:extent cx="2105319" cy="2038635"/>
+            <wp:effectExtent l="76200" t="76200" r="142875" b="133350"/>
+            <wp:docPr id="1852798721" name="Picture 1"/>
             <wp:cNvGraphicFramePr>
               <a:graphicFrameLocks xmlns:a="http://schemas.openxmlformats.org/drawingml/2006/main" noChangeAspect="1"/>
             </wp:cNvGraphicFramePr>
@@ -26,7 +34,7 @@
               <a:graphicData uri="http://schemas.openxmlformats.org/drawingml/2006/picture">
                 <pic:pic xmlns:pic="http://schemas.openxmlformats.org/drawingml/2006/picture">
                   <pic:nvPicPr>
-                    <pic:cNvPr id="1931260304" name=""/>
+                    <pic:cNvPr id="1852798721" name=""/>
                     <pic:cNvPicPr/>
                   </pic:nvPicPr>
                   <pic:blipFill>
@@ -38,7 +46,7 @@
                   <pic:spPr>
                     <a:xfrm>
                       <a:off x="0" y="0"/>
-                      <a:ext cx="5943600" cy="2879090"/>
+                      <a:ext cx="2105319" cy="2038635"/>
                     </a:xfrm>
                     <a:prstGeom prst="rect">
                       <a:avLst/>
@@ -66,28 +74,20 @@
       </w:r>
     </w:p>
     <w:p>
+      <w:pPr>
+        <w:pStyle w:val="Heading1"/>
+      </w:pPr>
       <w:r>
         <w:t>Go to the Color page</w:t>
       </w:r>
     </w:p>
     <w:p>
       <w:r>
-        <w:t xml:space="preserve">Use Gain on the Color page to do this. Gain controls Highlights or Brightness. On the color page you do not turn something black by increasing the shadow’s setting, you turn it to black by removing the brightness, and Gain is how you remove </w:t>
-      </w:r>
-      <w:r>
-        <w:t>brightness</w:t>
-      </w:r>
-      <w:r>
-        <w:t>.</w:t>
-      </w:r>
-    </w:p>
-    <w:p>
-      <w:r>
         <w:drawing>
-          <wp:inline distT="0" distB="0" distL="0" distR="0" wp14:anchorId="2BEE7AF8" wp14:editId="7F09BD58">
-            <wp:extent cx="5943600" cy="2193290"/>
-            <wp:effectExtent l="76200" t="76200" r="133350" b="130810"/>
-            <wp:docPr id="1020493855" name="Picture 1"/>
+          <wp:inline distT="0" distB="0" distL="0" distR="0" wp14:anchorId="1976B72D" wp14:editId="70CF01BE">
+            <wp:extent cx="1200318" cy="342948"/>
+            <wp:effectExtent l="76200" t="76200" r="133350" b="133350"/>
+            <wp:docPr id="1285276898" name="Picture 1"/>
             <wp:cNvGraphicFramePr>
               <a:graphicFrameLocks xmlns:a="http://schemas.openxmlformats.org/drawingml/2006/main" noChangeAspect="1"/>
             </wp:cNvGraphicFramePr>
@@ -95,7 +95,7 @@
               <a:graphicData uri="http://schemas.openxmlformats.org/drawingml/2006/picture">
                 <pic:pic xmlns:pic="http://schemas.openxmlformats.org/drawingml/2006/picture">
                   <pic:nvPicPr>
-                    <pic:cNvPr id="1020493855" name=""/>
+                    <pic:cNvPr id="1285276898" name=""/>
                     <pic:cNvPicPr/>
                   </pic:nvPicPr>
                   <pic:blipFill>
@@ -107,7 +107,7 @@
                   <pic:spPr>
                     <a:xfrm>
                       <a:off x="0" y="0"/>
-                      <a:ext cx="5943600" cy="2193290"/>
+                      <a:ext cx="1200318" cy="342948"/>
                     </a:xfrm>
                     <a:prstGeom prst="rect">
                       <a:avLst/>
@@ -136,25 +136,26 @@
     </w:p>
     <w:p>
       <w:r>
-        <w:t xml:space="preserve">In order to remove the glow from the sleeve, which is very bright. I had to set Gain down to 0.01, which is 1 away from pitch black. You only have Gain to work with here because Gamma and Lift </w:t>
-      </w:r>
-      <w:proofErr w:type="gramStart"/>
-      <w:r>
-        <w:t>is</w:t>
-      </w:r>
-      <w:proofErr w:type="gramEnd"/>
-      <w:r>
-        <w:t xml:space="preserve"> 0 by default, there is no lowering that you can get away with there.</w:t>
+        <w:t xml:space="preserve">Use </w:t>
+      </w:r>
+      <w:r>
+        <w:rPr>
+          <w:rStyle w:val="Strong"/>
+        </w:rPr>
+        <w:t>Gain</w:t>
+      </w:r>
+      <w:r>
+        <w:t xml:space="preserve"> on the Color page to do this. Gain controls Highlights or Brightness. On the color page you do not turn something black by increasing the shadow’s setting, you turn it to black by removing the brightness, and Gain is how you remove brightness.</w:t>
       </w:r>
     </w:p>
-    <w:p/>
     <w:p>
       <w:r>
+        <w:lastRenderedPageBreak/>
         <w:drawing>
-          <wp:inline distT="0" distB="0" distL="0" distR="0" wp14:anchorId="01D5FD08" wp14:editId="0958D515">
-            <wp:extent cx="5811061" cy="2905530"/>
-            <wp:effectExtent l="76200" t="76200" r="132715" b="142875"/>
-            <wp:docPr id="614532054" name="Picture 1"/>
+          <wp:inline distT="0" distB="0" distL="0" distR="0" wp14:anchorId="08A8094C" wp14:editId="53011DF9">
+            <wp:extent cx="5943600" cy="4734560"/>
+            <wp:effectExtent l="0" t="0" r="0" b="8890"/>
+            <wp:docPr id="1819724305" name="Picture 1"/>
             <wp:cNvGraphicFramePr>
               <a:graphicFrameLocks xmlns:a="http://schemas.openxmlformats.org/drawingml/2006/main" noChangeAspect="1"/>
             </wp:cNvGraphicFramePr>
@@ -162,7 +163,7 @@
               <a:graphicData uri="http://schemas.openxmlformats.org/drawingml/2006/picture">
                 <pic:pic xmlns:pic="http://schemas.openxmlformats.org/drawingml/2006/picture">
                   <pic:nvPicPr>
-                    <pic:cNvPr id="614532054" name=""/>
+                    <pic:cNvPr id="1819724305" name=""/>
                     <pic:cNvPicPr/>
                   </pic:nvPicPr>
                   <pic:blipFill>
@@ -174,7 +175,51 @@
                   <pic:spPr>
                     <a:xfrm>
                       <a:off x="0" y="0"/>
-                      <a:ext cx="5811061" cy="2905530"/>
+                      <a:ext cx="5943600" cy="4734560"/>
+                    </a:xfrm>
+                    <a:prstGeom prst="rect">
+                      <a:avLst/>
+                    </a:prstGeom>
+                  </pic:spPr>
+                </pic:pic>
+              </a:graphicData>
+            </a:graphic>
+          </wp:inline>
+        </w:drawing>
+      </w:r>
+    </w:p>
+    <w:p>
+      <w:r>
+        <w:t>I decided on 0.71</w:t>
+      </w:r>
+    </w:p>
+    <w:p>
+      <w:r>
+        <w:drawing>
+          <wp:inline distT="0" distB="0" distL="0" distR="0" wp14:anchorId="6997BF08" wp14:editId="5A435895">
+            <wp:extent cx="2305372" cy="2324424"/>
+            <wp:effectExtent l="76200" t="76200" r="133350" b="133350"/>
+            <wp:docPr id="1135178560" name="Picture 1"/>
+            <wp:cNvGraphicFramePr>
+              <a:graphicFrameLocks xmlns:a="http://schemas.openxmlformats.org/drawingml/2006/main" noChangeAspect="1"/>
+            </wp:cNvGraphicFramePr>
+            <a:graphic xmlns:a="http://schemas.openxmlformats.org/drawingml/2006/main">
+              <a:graphicData uri="http://schemas.openxmlformats.org/drawingml/2006/picture">
+                <pic:pic xmlns:pic="http://schemas.openxmlformats.org/drawingml/2006/picture">
+                  <pic:nvPicPr>
+                    <pic:cNvPr id="1135178560" name=""/>
+                    <pic:cNvPicPr/>
+                  </pic:nvPicPr>
+                  <pic:blipFill>
+                    <a:blip r:embed="rId8"/>
+                    <a:stretch>
+                      <a:fillRect/>
+                    </a:stretch>
+                  </pic:blipFill>
+                  <pic:spPr>
+                    <a:xfrm>
+                      <a:off x="0" y="0"/>
+                      <a:ext cx="2305372" cy="2324424"/>
                     </a:xfrm>
                     <a:prstGeom prst="rect">
                       <a:avLst/>
@@ -201,51 +246,20 @@
         </w:drawing>
       </w:r>
     </w:p>
+    <w:p/>
+    <w:p/>
     <w:p>
-      <w:pPr>
-        <w:numPr>
-          <w:ilvl w:val="0"/>
-          <w:numId w:val="12"/>
-        </w:numPr>
-      </w:pPr>
-      <w:r>
-        <w:t>Apply:</w:t>
-      </w:r>
-      <w:r>
-        <w:br/>
-      </w:r>
-      <w:r>
-        <w:rPr>
-          <w:rFonts w:ascii="Segoe UI Emoji" w:hAnsi="Segoe UI Emoji" w:cs="Segoe UI Emoji"/>
-        </w:rPr>
-        <w:t>👉</w:t>
-      </w:r>
-      <w:r>
-        <w:t xml:space="preserve"> </w:t>
-      </w:r>
-      <w:r>
-        <w:rPr>
-          <w:b/>
-          <w:bCs/>
-        </w:rPr>
-        <w:t>Gaussian Blur</w:t>
-      </w:r>
-      <w:r>
-        <w:t xml:space="preserve"> (soften it) </w:t>
+      <w:r>
+        <w:t>Just pull gain down until the teapot, which is on the bottom track looks like a shadow.</w:t>
       </w:r>
     </w:p>
     <w:p>
       <w:r>
-        <w:t>Go Back to the Edit Page. Now go to Effects at the top and choose Gaussian Blur</w:t>
-      </w:r>
-    </w:p>
-    <w:p>
-      <w:r>
         <w:drawing>
-          <wp:inline distT="0" distB="0" distL="0" distR="0" wp14:anchorId="5625ADF9" wp14:editId="7E90114E">
-            <wp:extent cx="3639058" cy="3572374"/>
-            <wp:effectExtent l="0" t="0" r="0" b="9525"/>
-            <wp:docPr id="1487674942" name="Picture 1"/>
+          <wp:inline distT="0" distB="0" distL="0" distR="0" wp14:anchorId="36F711AC" wp14:editId="037D402E">
+            <wp:extent cx="3743325" cy="2715746"/>
+            <wp:effectExtent l="76200" t="76200" r="123825" b="142240"/>
+            <wp:docPr id="228979574" name="Picture 1"/>
             <wp:cNvGraphicFramePr>
               <a:graphicFrameLocks xmlns:a="http://schemas.openxmlformats.org/drawingml/2006/main" noChangeAspect="1"/>
             </wp:cNvGraphicFramePr>
@@ -253,200 +267,7 @@
               <a:graphicData uri="http://schemas.openxmlformats.org/drawingml/2006/picture">
                 <pic:pic xmlns:pic="http://schemas.openxmlformats.org/drawingml/2006/picture">
                   <pic:nvPicPr>
-                    <pic:cNvPr id="1487674942" name=""/>
-                    <pic:cNvPicPr/>
-                  </pic:nvPicPr>
-                  <pic:blipFill>
-                    <a:blip r:embed="rId8"/>
-                    <a:stretch>
-                      <a:fillRect/>
-                    </a:stretch>
-                  </pic:blipFill>
-                  <pic:spPr>
-                    <a:xfrm>
-                      <a:off x="0" y="0"/>
-                      <a:ext cx="3639058" cy="3572374"/>
-                    </a:xfrm>
-                    <a:prstGeom prst="rect">
-                      <a:avLst/>
-                    </a:prstGeom>
-                  </pic:spPr>
-                </pic:pic>
-              </a:graphicData>
-            </a:graphic>
-          </wp:inline>
-        </w:drawing>
-      </w:r>
-    </w:p>
-    <w:p>
-      <w:r>
-        <w:lastRenderedPageBreak/>
-        <w:pict w14:anchorId="140158CB">
-          <v:rect id="_x0000_i1025" style="width:0;height:1.5pt" o:hralign="center" o:hrstd="t" o:hr="t" fillcolor="#a0a0a0" stroked="f"/>
-        </w:pict>
-      </w:r>
-    </w:p>
-    <w:p>
-      <w:pPr>
-        <w:rPr>
-          <w:b/>
-          <w:bCs/>
-        </w:rPr>
-      </w:pPr>
-      <w:r>
-        <w:rPr>
-          <w:b/>
-          <w:bCs/>
-        </w:rPr>
-        <w:t>Then:</w:t>
-      </w:r>
-    </w:p>
-    <w:p>
-      <w:pPr>
-        <w:numPr>
-          <w:ilvl w:val="0"/>
-          <w:numId w:val="13"/>
-        </w:numPr>
-      </w:pPr>
-      <w:r>
-        <w:t>Lower:</w:t>
-      </w:r>
-      <w:r>
-        <w:br/>
-      </w:r>
-      <w:r>
-        <w:rPr>
-          <w:rFonts w:ascii="Segoe UI Emoji" w:hAnsi="Segoe UI Emoji" w:cs="Segoe UI Emoji"/>
-        </w:rPr>
-        <w:t>👉</w:t>
-      </w:r>
-      <w:r>
-        <w:t xml:space="preserve"> </w:t>
-      </w:r>
-      <w:r>
-        <w:rPr>
-          <w:b/>
-          <w:bCs/>
-        </w:rPr>
-        <w:t>Opacity (20–40%)</w:t>
-      </w:r>
-      <w:r>
-        <w:t xml:space="preserve"> </w:t>
-      </w:r>
-    </w:p>
-    <w:p>
-      <w:r>
-        <w:pict w14:anchorId="12B8308D">
-          <v:rect id="_x0000_i1026" style="width:0;height:1.5pt" o:hralign="center" o:hrstd="t" o:hr="t" fillcolor="#a0a0a0" stroked="f"/>
-        </w:pict>
-      </w:r>
-    </w:p>
-    <w:p>
-      <w:pPr>
-        <w:rPr>
-          <w:b/>
-          <w:bCs/>
-        </w:rPr>
-      </w:pPr>
-      <w:r>
-        <w:rPr>
-          <w:b/>
-          <w:bCs/>
-        </w:rPr>
-        <w:t>Position it slightly:</w:t>
-      </w:r>
-    </w:p>
-    <w:p>
-      <w:pPr>
-        <w:numPr>
-          <w:ilvl w:val="0"/>
-          <w:numId w:val="14"/>
-        </w:numPr>
-      </w:pPr>
-      <w:r>
-        <w:t xml:space="preserve">Downward </w:t>
-      </w:r>
-    </w:p>
-    <w:p>
-      <w:pPr>
-        <w:numPr>
-          <w:ilvl w:val="0"/>
-          <w:numId w:val="14"/>
-        </w:numPr>
-      </w:pPr>
-      <w:r>
-        <w:t xml:space="preserve">Slightly toward the chair surface </w:t>
-      </w:r>
-    </w:p>
-    <w:p>
-      <w:r>
-        <w:pict w14:anchorId="3F2B4BAB">
-          <v:rect id="_x0000_i1027" style="width:0;height:1.5pt" o:hralign="center" o:hrstd="t" o:hr="t" fillcolor="#a0a0a0" stroked="f"/>
-        </w:pict>
-      </w:r>
-    </w:p>
-    <w:p>
-      <w:pPr>
-        <w:rPr>
-          <w:b/>
-          <w:bCs/>
-        </w:rPr>
-      </w:pPr>
-      <w:r>
-        <w:rPr>
-          <w:rFonts w:ascii="Segoe UI Emoji" w:hAnsi="Segoe UI Emoji" w:cs="Segoe UI Emoji"/>
-          <w:b/>
-          <w:bCs/>
-        </w:rPr>
-        <w:t>🎯</w:t>
-      </w:r>
-      <w:r>
-        <w:rPr>
-          <w:b/>
-          <w:bCs/>
-        </w:rPr>
-        <w:t xml:space="preserve"> What this does</w:t>
-      </w:r>
-    </w:p>
-    <w:p>
-      <w:r>
-        <w:t>Creates a:</w:t>
-      </w:r>
-      <w:r>
-        <w:br/>
-      </w:r>
-      <w:r>
-        <w:rPr>
-          <w:rFonts w:ascii="Segoe UI Emoji" w:hAnsi="Segoe UI Emoji" w:cs="Segoe UI Emoji"/>
-        </w:rPr>
-        <w:t>👉</w:t>
-      </w:r>
-      <w:r>
-        <w:t xml:space="preserve"> </w:t>
-      </w:r>
-      <w:r>
-        <w:rPr>
-          <w:b/>
-          <w:bCs/>
-        </w:rPr>
-        <w:t>fake contact shadow</w:t>
-      </w:r>
-    </w:p>
-    <w:p>
-      <w:r>
-        <w:drawing>
-          <wp:inline distT="0" distB="0" distL="0" distR="0" wp14:anchorId="1B785246" wp14:editId="4A7B1721">
-            <wp:extent cx="5943600" cy="4269105"/>
-            <wp:effectExtent l="76200" t="76200" r="133350" b="131445"/>
-            <wp:docPr id="2109555893" name="Picture 1"/>
-            <wp:cNvGraphicFramePr>
-              <a:graphicFrameLocks xmlns:a="http://schemas.openxmlformats.org/drawingml/2006/main" noChangeAspect="1"/>
-            </wp:cNvGraphicFramePr>
-            <a:graphic xmlns:a="http://schemas.openxmlformats.org/drawingml/2006/main">
-              <a:graphicData uri="http://schemas.openxmlformats.org/drawingml/2006/picture">
-                <pic:pic xmlns:pic="http://schemas.openxmlformats.org/drawingml/2006/picture">
-                  <pic:nvPicPr>
-                    <pic:cNvPr id="2109555893" name=""/>
+                    <pic:cNvPr id="228979574" name=""/>
                     <pic:cNvPicPr/>
                   </pic:nvPicPr>
                   <pic:blipFill>
@@ -458,7 +279,7 @@
                   <pic:spPr>
                     <a:xfrm>
                       <a:off x="0" y="0"/>
-                      <a:ext cx="5943600" cy="4269105"/>
+                      <a:ext cx="3748928" cy="2719811"/>
                     </a:xfrm>
                     <a:prstGeom prst="rect">
                       <a:avLst/>
@@ -485,6 +306,625 @@
         </w:drawing>
       </w:r>
     </w:p>
+    <w:p/>
+    <w:p>
+      <w:pPr>
+        <w:numPr>
+          <w:ilvl w:val="0"/>
+          <w:numId w:val="12"/>
+        </w:numPr>
+      </w:pPr>
+      <w:r>
+        <w:t>Apply:</w:t>
+      </w:r>
+      <w:r>
+        <w:br/>
+      </w:r>
+      <w:r>
+        <w:rPr>
+          <w:rFonts w:ascii="Segoe UI Emoji" w:hAnsi="Segoe UI Emoji" w:cs="Segoe UI Emoji"/>
+        </w:rPr>
+        <w:t>👉</w:t>
+      </w:r>
+      <w:r>
+        <w:t xml:space="preserve"> </w:t>
+      </w:r>
+      <w:r>
+        <w:rPr>
+          <w:b/>
+          <w:bCs/>
+        </w:rPr>
+        <w:t>Gaussian Blur</w:t>
+      </w:r>
+      <w:r>
+        <w:t xml:space="preserve"> (soften it) </w:t>
+      </w:r>
+    </w:p>
+    <w:p>
+      <w:r>
+        <w:t>Go Back to the Edit Page. Now go to Effects at the top and choose Gaussian Blur</w:t>
+      </w:r>
+    </w:p>
+    <w:p>
+      <w:r>
+        <w:rPr>
+          <w:noProof/>
+        </w:rPr>
+        <w:lastRenderedPageBreak/>
+        <w:drawing>
+          <wp:inline distT="0" distB="0" distL="0" distR="0" wp14:anchorId="5625ADF9" wp14:editId="3ACE5E5A">
+            <wp:extent cx="3448050" cy="3384866"/>
+            <wp:effectExtent l="0" t="0" r="0" b="6350"/>
+            <wp:docPr id="1487674942" name="Picture 1"/>
+            <wp:cNvGraphicFramePr>
+              <a:graphicFrameLocks xmlns:a="http://schemas.openxmlformats.org/drawingml/2006/main" noChangeAspect="1"/>
+            </wp:cNvGraphicFramePr>
+            <a:graphic xmlns:a="http://schemas.openxmlformats.org/drawingml/2006/main">
+              <a:graphicData uri="http://schemas.openxmlformats.org/drawingml/2006/picture">
+                <pic:pic xmlns:pic="http://schemas.openxmlformats.org/drawingml/2006/picture">
+                  <pic:nvPicPr>
+                    <pic:cNvPr id="1487674942" name=""/>
+                    <pic:cNvPicPr/>
+                  </pic:nvPicPr>
+                  <pic:blipFill>
+                    <a:blip r:embed="rId10"/>
+                    <a:stretch>
+                      <a:fillRect/>
+                    </a:stretch>
+                  </pic:blipFill>
+                  <pic:spPr>
+                    <a:xfrm>
+                      <a:off x="0" y="0"/>
+                      <a:ext cx="3451708" cy="3388457"/>
+                    </a:xfrm>
+                    <a:prstGeom prst="rect">
+                      <a:avLst/>
+                    </a:prstGeom>
+                  </pic:spPr>
+                </pic:pic>
+              </a:graphicData>
+            </a:graphic>
+          </wp:inline>
+        </w:drawing>
+      </w:r>
+    </w:p>
+    <w:p/>
+    <w:p>
+      <w:r>
+        <w:t>Just drag that text that says Gaussian Blur, in the Effects panel, down onto the teapot to give it a blur.</w:t>
+      </w:r>
+      <w:r>
+        <w:t xml:space="preserve"> I lowered my strength a bit to 0.481</w:t>
+      </w:r>
+    </w:p>
+    <w:p>
+      <w:r>
+        <w:drawing>
+          <wp:inline distT="0" distB="0" distL="0" distR="0" wp14:anchorId="75E19605" wp14:editId="6A452F55">
+            <wp:extent cx="4172532" cy="2553056"/>
+            <wp:effectExtent l="0" t="0" r="0" b="0"/>
+            <wp:docPr id="674776893" name="Picture 1"/>
+            <wp:cNvGraphicFramePr>
+              <a:graphicFrameLocks xmlns:a="http://schemas.openxmlformats.org/drawingml/2006/main" noChangeAspect="1"/>
+            </wp:cNvGraphicFramePr>
+            <a:graphic xmlns:a="http://schemas.openxmlformats.org/drawingml/2006/main">
+              <a:graphicData uri="http://schemas.openxmlformats.org/drawingml/2006/picture">
+                <pic:pic xmlns:pic="http://schemas.openxmlformats.org/drawingml/2006/picture">
+                  <pic:nvPicPr>
+                    <pic:cNvPr id="674776893" name=""/>
+                    <pic:cNvPicPr/>
+                  </pic:nvPicPr>
+                  <pic:blipFill>
+                    <a:blip r:embed="rId11"/>
+                    <a:stretch>
+                      <a:fillRect/>
+                    </a:stretch>
+                  </pic:blipFill>
+                  <pic:spPr>
+                    <a:xfrm>
+                      <a:off x="0" y="0"/>
+                      <a:ext cx="4172532" cy="2553056"/>
+                    </a:xfrm>
+                    <a:prstGeom prst="rect">
+                      <a:avLst/>
+                    </a:prstGeom>
+                  </pic:spPr>
+                </pic:pic>
+              </a:graphicData>
+            </a:graphic>
+          </wp:inline>
+        </w:drawing>
+      </w:r>
+    </w:p>
+    <w:p>
+      <w:pPr>
+        <w:pStyle w:val="Heading1"/>
+      </w:pPr>
+      <w:r>
+        <w:t>To Offset the Bottom Shadow Layer</w:t>
+      </w:r>
+    </w:p>
+    <w:p>
+      <w:r>
+        <w:t>Go to the Color page</w:t>
+      </w:r>
+    </w:p>
+    <w:p>
+      <w:r>
+        <w:lastRenderedPageBreak/>
+        <w:drawing>
+          <wp:inline distT="0" distB="0" distL="0" distR="0" wp14:anchorId="575CBB44" wp14:editId="1B890A8E">
+            <wp:extent cx="1200318" cy="342948"/>
+            <wp:effectExtent l="76200" t="76200" r="133350" b="133350"/>
+            <wp:docPr id="945299935" name="Picture 1"/>
+            <wp:cNvGraphicFramePr>
+              <a:graphicFrameLocks xmlns:a="http://schemas.openxmlformats.org/drawingml/2006/main" noChangeAspect="1"/>
+            </wp:cNvGraphicFramePr>
+            <a:graphic xmlns:a="http://schemas.openxmlformats.org/drawingml/2006/main">
+              <a:graphicData uri="http://schemas.openxmlformats.org/drawingml/2006/picture">
+                <pic:pic xmlns:pic="http://schemas.openxmlformats.org/drawingml/2006/picture">
+                  <pic:nvPicPr>
+                    <pic:cNvPr id="1285276898" name=""/>
+                    <pic:cNvPicPr/>
+                  </pic:nvPicPr>
+                  <pic:blipFill>
+                    <a:blip r:embed="rId6"/>
+                    <a:stretch>
+                      <a:fillRect/>
+                    </a:stretch>
+                  </pic:blipFill>
+                  <pic:spPr>
+                    <a:xfrm>
+                      <a:off x="0" y="0"/>
+                      <a:ext cx="1200318" cy="342948"/>
+                    </a:xfrm>
+                    <a:prstGeom prst="rect">
+                      <a:avLst/>
+                    </a:prstGeom>
+                    <a:ln w="38100" cap="sq">
+                      <a:solidFill>
+                        <a:srgbClr val="000000"/>
+                      </a:solidFill>
+                      <a:prstDash val="solid"/>
+                      <a:miter lim="800000"/>
+                    </a:ln>
+                    <a:effectLst>
+                      <a:outerShdw blurRad="50800" dist="38100" dir="2700000" algn="tl" rotWithShape="0">
+                        <a:srgbClr val="000000">
+                          <a:alpha val="43000"/>
+                        </a:srgbClr>
+                      </a:outerShdw>
+                    </a:effectLst>
+                  </pic:spPr>
+                </pic:pic>
+              </a:graphicData>
+            </a:graphic>
+          </wp:inline>
+        </w:drawing>
+      </w:r>
+    </w:p>
+    <w:p>
+      <w:r>
+        <w:t xml:space="preserve">Make sure you have the correct layer selected here. Remember we added a gaussian Blur, So, it should have an </w:t>
+      </w:r>
+      <w:r>
+        <w:rPr>
+          <w:rStyle w:val="Strong"/>
+        </w:rPr>
+        <w:t>fx</w:t>
+      </w:r>
+      <w:r>
+        <w:t xml:space="preserve"> in the right-hand bottom corner.</w:t>
+      </w:r>
+    </w:p>
+    <w:p>
+      <w:r>
+        <w:drawing>
+          <wp:inline distT="0" distB="0" distL="0" distR="0" wp14:anchorId="0D8872E1" wp14:editId="46ABD00B">
+            <wp:extent cx="4296375" cy="1629002"/>
+            <wp:effectExtent l="0" t="0" r="9525" b="9525"/>
+            <wp:docPr id="1751898689" name="Picture 1"/>
+            <wp:cNvGraphicFramePr>
+              <a:graphicFrameLocks xmlns:a="http://schemas.openxmlformats.org/drawingml/2006/main" noChangeAspect="1"/>
+            </wp:cNvGraphicFramePr>
+            <a:graphic xmlns:a="http://schemas.openxmlformats.org/drawingml/2006/main">
+              <a:graphicData uri="http://schemas.openxmlformats.org/drawingml/2006/picture">
+                <pic:pic xmlns:pic="http://schemas.openxmlformats.org/drawingml/2006/picture">
+                  <pic:nvPicPr>
+                    <pic:cNvPr id="1751898689" name=""/>
+                    <pic:cNvPicPr/>
+                  </pic:nvPicPr>
+                  <pic:blipFill>
+                    <a:blip r:embed="rId12"/>
+                    <a:stretch>
+                      <a:fillRect/>
+                    </a:stretch>
+                  </pic:blipFill>
+                  <pic:spPr>
+                    <a:xfrm>
+                      <a:off x="0" y="0"/>
+                      <a:ext cx="4296375" cy="1629002"/>
+                    </a:xfrm>
+                    <a:prstGeom prst="rect">
+                      <a:avLst/>
+                    </a:prstGeom>
+                  </pic:spPr>
+                </pic:pic>
+              </a:graphicData>
+            </a:graphic>
+          </wp:inline>
+        </w:drawing>
+      </w:r>
+    </w:p>
+    <w:p>
+      <w:r>
+        <w:t xml:space="preserve">Go to the bottom of this page where your color wheels are. </w:t>
+      </w:r>
+    </w:p>
+    <w:p>
+      <w:r>
+        <w:drawing>
+          <wp:inline distT="0" distB="0" distL="0" distR="0" wp14:anchorId="4E8D12D7" wp14:editId="786BF434">
+            <wp:extent cx="5943600" cy="2011680"/>
+            <wp:effectExtent l="76200" t="76200" r="133350" b="140970"/>
+            <wp:docPr id="801888921" name="Picture 1"/>
+            <wp:cNvGraphicFramePr>
+              <a:graphicFrameLocks xmlns:a="http://schemas.openxmlformats.org/drawingml/2006/main" noChangeAspect="1"/>
+            </wp:cNvGraphicFramePr>
+            <a:graphic xmlns:a="http://schemas.openxmlformats.org/drawingml/2006/main">
+              <a:graphicData uri="http://schemas.openxmlformats.org/drawingml/2006/picture">
+                <pic:pic xmlns:pic="http://schemas.openxmlformats.org/drawingml/2006/picture">
+                  <pic:nvPicPr>
+                    <pic:cNvPr id="801888921" name=""/>
+                    <pic:cNvPicPr/>
+                  </pic:nvPicPr>
+                  <pic:blipFill>
+                    <a:blip r:embed="rId13"/>
+                    <a:stretch>
+                      <a:fillRect/>
+                    </a:stretch>
+                  </pic:blipFill>
+                  <pic:spPr>
+                    <a:xfrm>
+                      <a:off x="0" y="0"/>
+                      <a:ext cx="5943600" cy="2011680"/>
+                    </a:xfrm>
+                    <a:prstGeom prst="rect">
+                      <a:avLst/>
+                    </a:prstGeom>
+                    <a:ln w="38100" cap="sq">
+                      <a:solidFill>
+                        <a:srgbClr val="000000"/>
+                      </a:solidFill>
+                      <a:prstDash val="solid"/>
+                      <a:miter lim="800000"/>
+                    </a:ln>
+                    <a:effectLst>
+                      <a:outerShdw blurRad="50800" dist="38100" dir="2700000" algn="tl" rotWithShape="0">
+                        <a:srgbClr val="000000">
+                          <a:alpha val="43000"/>
+                        </a:srgbClr>
+                      </a:outerShdw>
+                    </a:effectLst>
+                  </pic:spPr>
+                </pic:pic>
+              </a:graphicData>
+            </a:graphic>
+          </wp:inline>
+        </w:drawing>
+      </w:r>
+    </w:p>
+    <w:p>
+      <w:r>
+        <w:t xml:space="preserve">We want </w:t>
+      </w:r>
+      <w:r>
+        <w:rPr>
+          <w:rStyle w:val="Strong"/>
+        </w:rPr>
+        <w:t>Input Sizing</w:t>
+      </w:r>
+      <w:r>
+        <w:t>, so go to this icon here.</w:t>
+      </w:r>
+    </w:p>
+    <w:p>
+      <w:r>
+        <w:drawing>
+          <wp:inline distT="0" distB="0" distL="0" distR="0" wp14:anchorId="014C167A" wp14:editId="5F0700EA">
+            <wp:extent cx="3429479" cy="1286054"/>
+            <wp:effectExtent l="0" t="0" r="0" b="0"/>
+            <wp:docPr id="84897762" name="Picture 1"/>
+            <wp:cNvGraphicFramePr>
+              <a:graphicFrameLocks xmlns:a="http://schemas.openxmlformats.org/drawingml/2006/main" noChangeAspect="1"/>
+            </wp:cNvGraphicFramePr>
+            <a:graphic xmlns:a="http://schemas.openxmlformats.org/drawingml/2006/main">
+              <a:graphicData uri="http://schemas.openxmlformats.org/drawingml/2006/picture">
+                <pic:pic xmlns:pic="http://schemas.openxmlformats.org/drawingml/2006/picture">
+                  <pic:nvPicPr>
+                    <pic:cNvPr id="84897762" name=""/>
+                    <pic:cNvPicPr/>
+                  </pic:nvPicPr>
+                  <pic:blipFill>
+                    <a:blip r:embed="rId14"/>
+                    <a:stretch>
+                      <a:fillRect/>
+                    </a:stretch>
+                  </pic:blipFill>
+                  <pic:spPr>
+                    <a:xfrm>
+                      <a:off x="0" y="0"/>
+                      <a:ext cx="3429479" cy="1286054"/>
+                    </a:xfrm>
+                    <a:prstGeom prst="rect">
+                      <a:avLst/>
+                    </a:prstGeom>
+                  </pic:spPr>
+                </pic:pic>
+              </a:graphicData>
+            </a:graphic>
+          </wp:inline>
+        </w:drawing>
+      </w:r>
+    </w:p>
+    <w:p>
+      <w:pPr>
+        <w:spacing w:before="100" w:beforeAutospacing="1" w:after="100" w:afterAutospacing="1" w:line="240" w:lineRule="auto"/>
+        <w:rPr>
+          <w:rFonts w:ascii="Times New Roman" w:eastAsia="Times New Roman" w:hAnsi="Times New Roman" w:cs="Times New Roman"/>
+          <w:kern w:val="0"/>
+          <w:sz w:val="24"/>
+          <w:szCs w:val="24"/>
+          <w14:ligatures w14:val="none"/>
+        </w:rPr>
+      </w:pPr>
+      <w:r>
+        <w:rPr>
+          <w:rFonts w:ascii="Times New Roman" w:eastAsia="Times New Roman" w:hAnsi="Times New Roman" w:cs="Times New Roman"/>
+          <w:kern w:val="0"/>
+          <w:sz w:val="24"/>
+          <w:szCs w:val="24"/>
+          <w14:ligatures w14:val="none"/>
+        </w:rPr>
+        <w:t xml:space="preserve">Inside </w:t>
+      </w:r>
+      <w:r>
+        <w:rPr>
+          <w:rFonts w:ascii="Times New Roman" w:eastAsia="Times New Roman" w:hAnsi="Times New Roman" w:cs="Times New Roman"/>
+          <w:b/>
+          <w:bCs/>
+          <w:kern w:val="0"/>
+          <w:sz w:val="24"/>
+          <w:szCs w:val="24"/>
+          <w14:ligatures w14:val="none"/>
+        </w:rPr>
+        <w:t>Input Sizing</w:t>
+      </w:r>
+      <w:r>
+        <w:rPr>
+          <w:rFonts w:ascii="Times New Roman" w:eastAsia="Times New Roman" w:hAnsi="Times New Roman" w:cs="Times New Roman"/>
+          <w:kern w:val="0"/>
+          <w:sz w:val="24"/>
+          <w:szCs w:val="24"/>
+          <w14:ligatures w14:val="none"/>
+        </w:rPr>
+        <w:t>, the controls you want are:</w:t>
+      </w:r>
+    </w:p>
+    <w:p>
+      <w:pPr>
+        <w:spacing w:before="100" w:beforeAutospacing="1" w:after="100" w:afterAutospacing="1" w:line="240" w:lineRule="auto"/>
+        <w:rPr>
+          <w:rFonts w:ascii="Times New Roman" w:eastAsia="Times New Roman" w:hAnsi="Times New Roman" w:cs="Times New Roman"/>
+          <w:kern w:val="0"/>
+          <w:sz w:val="24"/>
+          <w:szCs w:val="24"/>
+          <w14:ligatures w14:val="none"/>
+        </w:rPr>
+      </w:pPr>
+    </w:p>
+    <w:p>
+      <w:pPr>
+        <w:pStyle w:val="NoSpacing"/>
+      </w:pPr>
+      <w:r>
+        <w:rPr>
+          <w:rStyle w:val="Strong"/>
+        </w:rPr>
+        <w:lastRenderedPageBreak/>
+        <w:t>Pan (X)</w:t>
+      </w:r>
+      <w:r>
+        <w:t xml:space="preserve"> → moves the shadow left/right</w:t>
+      </w:r>
+    </w:p>
+    <w:p>
+      <w:pPr>
+        <w:pStyle w:val="NoSpacing"/>
+      </w:pPr>
+      <w:r>
+        <w:rPr>
+          <w:rStyle w:val="Strong"/>
+        </w:rPr>
+        <w:t xml:space="preserve">Tilt (Y) </w:t>
+      </w:r>
+      <w:r>
+        <w:t>→ moves the shadow up/down</w:t>
+      </w:r>
+    </w:p>
+    <w:p>
+      <w:pPr>
+        <w:pStyle w:val="NoSpacing"/>
+      </w:pPr>
+      <w:r>
+        <w:rPr>
+          <w:rStyle w:val="Strong"/>
+        </w:rPr>
+        <w:t>Zoom</w:t>
+      </w:r>
+      <w:r>
+        <w:t xml:space="preserve"> → makes the shadow slightly smaller or larger</w:t>
+      </w:r>
+    </w:p>
+    <w:p>
+      <w:pPr>
+        <w:spacing w:before="100" w:beforeAutospacing="1" w:after="100" w:afterAutospacing="1" w:line="240" w:lineRule="auto"/>
+        <w:outlineLvl w:val="2"/>
+        <w:rPr>
+          <w:rFonts w:ascii="Times New Roman" w:eastAsia="Times New Roman" w:hAnsi="Times New Roman" w:cs="Times New Roman"/>
+          <w:b/>
+          <w:bCs/>
+          <w:kern w:val="0"/>
+          <w:sz w:val="27"/>
+          <w:szCs w:val="27"/>
+          <w14:ligatures w14:val="none"/>
+        </w:rPr>
+      </w:pPr>
+    </w:p>
+    <w:p>
+      <w:r>
+        <w:t>These are the numbers that I finally used for my teapot</w:t>
+      </w:r>
+    </w:p>
+    <w:p>
+      <w:pPr>
+        <w:pStyle w:val="NormalWeb"/>
+        <w:numPr>
+          <w:ilvl w:val="0"/>
+          <w:numId w:val="16"/>
+        </w:numPr>
+      </w:pPr>
+      <w:r>
+        <w:rPr>
+          <w:rStyle w:val="Strong"/>
+        </w:rPr>
+        <w:t>Pan:</w:t>
+      </w:r>
+      <w:r>
+        <w:t xml:space="preserve"> </w:t>
+      </w:r>
+      <w:r>
+        <w:rPr>
+          <w:rStyle w:val="HTMLCode"/>
+        </w:rPr>
+        <w:t>0.600</w:t>
+      </w:r>
+    </w:p>
+    <w:p>
+      <w:pPr>
+        <w:pStyle w:val="NormalWeb"/>
+        <w:numPr>
+          <w:ilvl w:val="0"/>
+          <w:numId w:val="16"/>
+        </w:numPr>
+      </w:pPr>
+      <w:r>
+        <w:rPr>
+          <w:rStyle w:val="Strong"/>
+        </w:rPr>
+        <w:t>Tilt:</w:t>
+      </w:r>
+      <w:r>
+        <w:t xml:space="preserve"> </w:t>
+      </w:r>
+      <w:r>
+        <w:rPr>
+          <w:rStyle w:val="HTMLCode"/>
+        </w:rPr>
+        <w:t>-0.600</w:t>
+      </w:r>
+    </w:p>
+    <w:p>
+      <w:pPr>
+        <w:pStyle w:val="NormalWeb"/>
+        <w:numPr>
+          <w:ilvl w:val="0"/>
+          <w:numId w:val="16"/>
+        </w:numPr>
+        <w:rPr>
+          <w:rStyle w:val="HTMLCode"/>
+          <w:rFonts w:ascii="Times New Roman" w:hAnsi="Times New Roman" w:cs="Times New Roman"/>
+          <w:sz w:val="24"/>
+          <w:szCs w:val="24"/>
+        </w:rPr>
+      </w:pPr>
+      <w:r>
+        <w:rPr>
+          <w:rStyle w:val="Strong"/>
+        </w:rPr>
+        <w:t>Zoom:</w:t>
+      </w:r>
+      <w:r>
+        <w:t xml:space="preserve"> </w:t>
+      </w:r>
+      <w:r>
+        <w:rPr>
+          <w:rStyle w:val="HTMLCode"/>
+        </w:rPr>
+        <w:t>0.986</w:t>
+      </w:r>
+    </w:p>
+    <w:p>
+      <w:pPr>
+        <w:pStyle w:val="NormalWeb"/>
+      </w:pPr>
+      <w:r>
+        <w:t>This is the shadow that it created</w:t>
+      </w:r>
+    </w:p>
+    <w:p>
+      <w:r>
+        <w:drawing>
+          <wp:inline distT="0" distB="0" distL="0" distR="0" wp14:anchorId="097DEACF" wp14:editId="49A966C7">
+            <wp:extent cx="4772691" cy="3553321"/>
+            <wp:effectExtent l="76200" t="76200" r="142240" b="142875"/>
+            <wp:docPr id="353794789" name="Picture 1"/>
+            <wp:cNvGraphicFramePr>
+              <a:graphicFrameLocks xmlns:a="http://schemas.openxmlformats.org/drawingml/2006/main" noChangeAspect="1"/>
+            </wp:cNvGraphicFramePr>
+            <a:graphic xmlns:a="http://schemas.openxmlformats.org/drawingml/2006/main">
+              <a:graphicData uri="http://schemas.openxmlformats.org/drawingml/2006/picture">
+                <pic:pic xmlns:pic="http://schemas.openxmlformats.org/drawingml/2006/picture">
+                  <pic:nvPicPr>
+                    <pic:cNvPr id="353794789" name=""/>
+                    <pic:cNvPicPr/>
+                  </pic:nvPicPr>
+                  <pic:blipFill>
+                    <a:blip r:embed="rId15"/>
+                    <a:stretch>
+                      <a:fillRect/>
+                    </a:stretch>
+                  </pic:blipFill>
+                  <pic:spPr>
+                    <a:xfrm>
+                      <a:off x="0" y="0"/>
+                      <a:ext cx="4772691" cy="3553321"/>
+                    </a:xfrm>
+                    <a:prstGeom prst="rect">
+                      <a:avLst/>
+                    </a:prstGeom>
+                    <a:ln w="38100" cap="sq">
+                      <a:solidFill>
+                        <a:srgbClr val="000000"/>
+                      </a:solidFill>
+                      <a:prstDash val="solid"/>
+                      <a:miter lim="800000"/>
+                    </a:ln>
+                    <a:effectLst>
+                      <a:outerShdw blurRad="50800" dist="38100" dir="2700000" algn="tl" rotWithShape="0">
+                        <a:srgbClr val="000000">
+                          <a:alpha val="43000"/>
+                        </a:srgbClr>
+                      </a:outerShdw>
+                    </a:effectLst>
+                  </pic:spPr>
+                </pic:pic>
+              </a:graphicData>
+            </a:graphic>
+          </wp:inline>
+        </w:drawing>
+      </w:r>
+    </w:p>
     <w:sectPr>
       <w:pgSz w:w="12240" w:h="15840"/>
       <w:pgMar w:top="1440" w:right="1440" w:bottom="1440" w:left="1440" w:header="720" w:footer="720" w:gutter="0"/>
@@ -516,6 +956,155 @@
     </w:lvl>
   </w:abstractNum>
   <w:abstractNum w:abstractNumId="1" w15:restartNumberingAfterBreak="0">
+    <w:nsid w:val="10D60B07"/>
+    <w:multiLevelType w:val="multilevel"/>
+    <w:tmpl w:val="88D86F2C"/>
+    <w:lvl w:ilvl="0">
+      <w:start w:val="1"/>
+      <w:numFmt w:val="bullet"/>
+      <w:lvlText w:val=""/>
+      <w:lvlJc w:val="left"/>
+      <w:pPr>
+        <w:tabs>
+          <w:tab w:val="num" w:pos="720"/>
+        </w:tabs>
+        <w:ind w:left="720" w:hanging="360"/>
+      </w:pPr>
+      <w:rPr>
+        <w:rFonts w:ascii="Symbol" w:hAnsi="Symbol" w:hint="default"/>
+        <w:sz w:val="20"/>
+      </w:rPr>
+    </w:lvl>
+    <w:lvl w:ilvl="1" w:tentative="1">
+      <w:start w:val="1"/>
+      <w:numFmt w:val="bullet"/>
+      <w:lvlText w:val="o"/>
+      <w:lvlJc w:val="left"/>
+      <w:pPr>
+        <w:tabs>
+          <w:tab w:val="num" w:pos="1440"/>
+        </w:tabs>
+        <w:ind w:left="1440" w:hanging="360"/>
+      </w:pPr>
+      <w:rPr>
+        <w:rFonts w:ascii="Courier New" w:hAnsi="Courier New" w:hint="default"/>
+        <w:sz w:val="20"/>
+      </w:rPr>
+    </w:lvl>
+    <w:lvl w:ilvl="2" w:tentative="1">
+      <w:start w:val="1"/>
+      <w:numFmt w:val="bullet"/>
+      <w:lvlText w:val=""/>
+      <w:lvlJc w:val="left"/>
+      <w:pPr>
+        <w:tabs>
+          <w:tab w:val="num" w:pos="2160"/>
+        </w:tabs>
+        <w:ind w:left="2160" w:hanging="360"/>
+      </w:pPr>
+      <w:rPr>
+        <w:rFonts w:ascii="Wingdings" w:hAnsi="Wingdings" w:hint="default"/>
+        <w:sz w:val="20"/>
+      </w:rPr>
+    </w:lvl>
+    <w:lvl w:ilvl="3" w:tentative="1">
+      <w:start w:val="1"/>
+      <w:numFmt w:val="bullet"/>
+      <w:lvlText w:val=""/>
+      <w:lvlJc w:val="left"/>
+      <w:pPr>
+        <w:tabs>
+          <w:tab w:val="num" w:pos="2880"/>
+        </w:tabs>
+        <w:ind w:left="2880" w:hanging="360"/>
+      </w:pPr>
+      <w:rPr>
+        <w:rFonts w:ascii="Wingdings" w:hAnsi="Wingdings" w:hint="default"/>
+        <w:sz w:val="20"/>
+      </w:rPr>
+    </w:lvl>
+    <w:lvl w:ilvl="4" w:tentative="1">
+      <w:start w:val="1"/>
+      <w:numFmt w:val="bullet"/>
+      <w:lvlText w:val=""/>
+      <w:lvlJc w:val="left"/>
+      <w:pPr>
+        <w:tabs>
+          <w:tab w:val="num" w:pos="3600"/>
+        </w:tabs>
+        <w:ind w:left="3600" w:hanging="360"/>
+      </w:pPr>
+      <w:rPr>
+        <w:rFonts w:ascii="Wingdings" w:hAnsi="Wingdings" w:hint="default"/>
+        <w:sz w:val="20"/>
+      </w:rPr>
+    </w:lvl>
+    <w:lvl w:ilvl="5" w:tentative="1">
+      <w:start w:val="1"/>
+      <w:numFmt w:val="bullet"/>
+      <w:lvlText w:val=""/>
+      <w:lvlJc w:val="left"/>
+      <w:pPr>
+        <w:tabs>
+          <w:tab w:val="num" w:pos="4320"/>
+        </w:tabs>
+        <w:ind w:left="4320" w:hanging="360"/>
+      </w:pPr>
+      <w:rPr>
+        <w:rFonts w:ascii="Wingdings" w:hAnsi="Wingdings" w:hint="default"/>
+        <w:sz w:val="20"/>
+      </w:rPr>
+    </w:lvl>
+    <w:lvl w:ilvl="6" w:tentative="1">
+      <w:start w:val="1"/>
+      <w:numFmt w:val="bullet"/>
+      <w:lvlText w:val=""/>
+      <w:lvlJc w:val="left"/>
+      <w:pPr>
+        <w:tabs>
+          <w:tab w:val="num" w:pos="5040"/>
+        </w:tabs>
+        <w:ind w:left="5040" w:hanging="360"/>
+      </w:pPr>
+      <w:rPr>
+        <w:rFonts w:ascii="Wingdings" w:hAnsi="Wingdings" w:hint="default"/>
+        <w:sz w:val="20"/>
+      </w:rPr>
+    </w:lvl>
+    <w:lvl w:ilvl="7" w:tentative="1">
+      <w:start w:val="1"/>
+      <w:numFmt w:val="bullet"/>
+      <w:lvlText w:val=""/>
+      <w:lvlJc w:val="left"/>
+      <w:pPr>
+        <w:tabs>
+          <w:tab w:val="num" w:pos="5760"/>
+        </w:tabs>
+        <w:ind w:left="5760" w:hanging="360"/>
+      </w:pPr>
+      <w:rPr>
+        <w:rFonts w:ascii="Wingdings" w:hAnsi="Wingdings" w:hint="default"/>
+        <w:sz w:val="20"/>
+      </w:rPr>
+    </w:lvl>
+    <w:lvl w:ilvl="8" w:tentative="1">
+      <w:start w:val="1"/>
+      <w:numFmt w:val="bullet"/>
+      <w:lvlText w:val=""/>
+      <w:lvlJc w:val="left"/>
+      <w:pPr>
+        <w:tabs>
+          <w:tab w:val="num" w:pos="6480"/>
+        </w:tabs>
+        <w:ind w:left="6480" w:hanging="360"/>
+      </w:pPr>
+      <w:rPr>
+        <w:rFonts w:ascii="Wingdings" w:hAnsi="Wingdings" w:hint="default"/>
+        <w:sz w:val="20"/>
+      </w:rPr>
+    </w:lvl>
+  </w:abstractNum>
+  <w:abstractNum w:abstractNumId="2" w15:restartNumberingAfterBreak="0">
     <w:nsid w:val="125D292A"/>
     <w:multiLevelType w:val="hybridMultilevel"/>
     <w:tmpl w:val="0F5C8652"/>
@@ -629,7 +1218,7 @@
       </w:rPr>
     </w:lvl>
   </w:abstractNum>
-  <w:abstractNum w:abstractNumId="2" w15:restartNumberingAfterBreak="0">
+  <w:abstractNum w:abstractNumId="3" w15:restartNumberingAfterBreak="0">
     <w:nsid w:val="141C3A76"/>
     <w:multiLevelType w:val="multilevel"/>
     <w:tmpl w:val="05DE60D6"/>
@@ -778,7 +1367,7 @@
       </w:rPr>
     </w:lvl>
   </w:abstractNum>
-  <w:abstractNum w:abstractNumId="3" w15:restartNumberingAfterBreak="0">
+  <w:abstractNum w:abstractNumId="4" w15:restartNumberingAfterBreak="0">
     <w:nsid w:val="68E1444D"/>
     <w:multiLevelType w:val="multilevel"/>
     <w:tmpl w:val="E9DC390E"/>
@@ -927,7 +1516,156 @@
       </w:rPr>
     </w:lvl>
   </w:abstractNum>
-  <w:abstractNum w:abstractNumId="4" w15:restartNumberingAfterBreak="0">
+  <w:abstractNum w:abstractNumId="5" w15:restartNumberingAfterBreak="0">
+    <w:nsid w:val="6A0916D1"/>
+    <w:multiLevelType w:val="multilevel"/>
+    <w:tmpl w:val="FC76FC50"/>
+    <w:lvl w:ilvl="0">
+      <w:start w:val="1"/>
+      <w:numFmt w:val="bullet"/>
+      <w:lvlText w:val=""/>
+      <w:lvlJc w:val="left"/>
+      <w:pPr>
+        <w:tabs>
+          <w:tab w:val="num" w:pos="720"/>
+        </w:tabs>
+        <w:ind w:left="720" w:hanging="360"/>
+      </w:pPr>
+      <w:rPr>
+        <w:rFonts w:ascii="Symbol" w:hAnsi="Symbol" w:hint="default"/>
+        <w:sz w:val="20"/>
+      </w:rPr>
+    </w:lvl>
+    <w:lvl w:ilvl="1" w:tentative="1">
+      <w:start w:val="1"/>
+      <w:numFmt w:val="bullet"/>
+      <w:lvlText w:val="o"/>
+      <w:lvlJc w:val="left"/>
+      <w:pPr>
+        <w:tabs>
+          <w:tab w:val="num" w:pos="1440"/>
+        </w:tabs>
+        <w:ind w:left="1440" w:hanging="360"/>
+      </w:pPr>
+      <w:rPr>
+        <w:rFonts w:ascii="Courier New" w:hAnsi="Courier New" w:hint="default"/>
+        <w:sz w:val="20"/>
+      </w:rPr>
+    </w:lvl>
+    <w:lvl w:ilvl="2" w:tentative="1">
+      <w:start w:val="1"/>
+      <w:numFmt w:val="bullet"/>
+      <w:lvlText w:val=""/>
+      <w:lvlJc w:val="left"/>
+      <w:pPr>
+        <w:tabs>
+          <w:tab w:val="num" w:pos="2160"/>
+        </w:tabs>
+        <w:ind w:left="2160" w:hanging="360"/>
+      </w:pPr>
+      <w:rPr>
+        <w:rFonts w:ascii="Wingdings" w:hAnsi="Wingdings" w:hint="default"/>
+        <w:sz w:val="20"/>
+      </w:rPr>
+    </w:lvl>
+    <w:lvl w:ilvl="3" w:tentative="1">
+      <w:start w:val="1"/>
+      <w:numFmt w:val="bullet"/>
+      <w:lvlText w:val=""/>
+      <w:lvlJc w:val="left"/>
+      <w:pPr>
+        <w:tabs>
+          <w:tab w:val="num" w:pos="2880"/>
+        </w:tabs>
+        <w:ind w:left="2880" w:hanging="360"/>
+      </w:pPr>
+      <w:rPr>
+        <w:rFonts w:ascii="Wingdings" w:hAnsi="Wingdings" w:hint="default"/>
+        <w:sz w:val="20"/>
+      </w:rPr>
+    </w:lvl>
+    <w:lvl w:ilvl="4" w:tentative="1">
+      <w:start w:val="1"/>
+      <w:numFmt w:val="bullet"/>
+      <w:lvlText w:val=""/>
+      <w:lvlJc w:val="left"/>
+      <w:pPr>
+        <w:tabs>
+          <w:tab w:val="num" w:pos="3600"/>
+        </w:tabs>
+        <w:ind w:left="3600" w:hanging="360"/>
+      </w:pPr>
+      <w:rPr>
+        <w:rFonts w:ascii="Wingdings" w:hAnsi="Wingdings" w:hint="default"/>
+        <w:sz w:val="20"/>
+      </w:rPr>
+    </w:lvl>
+    <w:lvl w:ilvl="5" w:tentative="1">
+      <w:start w:val="1"/>
+      <w:numFmt w:val="bullet"/>
+      <w:lvlText w:val=""/>
+      <w:lvlJc w:val="left"/>
+      <w:pPr>
+        <w:tabs>
+          <w:tab w:val="num" w:pos="4320"/>
+        </w:tabs>
+        <w:ind w:left="4320" w:hanging="360"/>
+      </w:pPr>
+      <w:rPr>
+        <w:rFonts w:ascii="Wingdings" w:hAnsi="Wingdings" w:hint="default"/>
+        <w:sz w:val="20"/>
+      </w:rPr>
+    </w:lvl>
+    <w:lvl w:ilvl="6" w:tentative="1">
+      <w:start w:val="1"/>
+      <w:numFmt w:val="bullet"/>
+      <w:lvlText w:val=""/>
+      <w:lvlJc w:val="left"/>
+      <w:pPr>
+        <w:tabs>
+          <w:tab w:val="num" w:pos="5040"/>
+        </w:tabs>
+        <w:ind w:left="5040" w:hanging="360"/>
+      </w:pPr>
+      <w:rPr>
+        <w:rFonts w:ascii="Wingdings" w:hAnsi="Wingdings" w:hint="default"/>
+        <w:sz w:val="20"/>
+      </w:rPr>
+    </w:lvl>
+    <w:lvl w:ilvl="7" w:tentative="1">
+      <w:start w:val="1"/>
+      <w:numFmt w:val="bullet"/>
+      <w:lvlText w:val=""/>
+      <w:lvlJc w:val="left"/>
+      <w:pPr>
+        <w:tabs>
+          <w:tab w:val="num" w:pos="5760"/>
+        </w:tabs>
+        <w:ind w:left="5760" w:hanging="360"/>
+      </w:pPr>
+      <w:rPr>
+        <w:rFonts w:ascii="Wingdings" w:hAnsi="Wingdings" w:hint="default"/>
+        <w:sz w:val="20"/>
+      </w:rPr>
+    </w:lvl>
+    <w:lvl w:ilvl="8" w:tentative="1">
+      <w:start w:val="1"/>
+      <w:numFmt w:val="bullet"/>
+      <w:lvlText w:val=""/>
+      <w:lvlJc w:val="left"/>
+      <w:pPr>
+        <w:tabs>
+          <w:tab w:val="num" w:pos="6480"/>
+        </w:tabs>
+        <w:ind w:left="6480" w:hanging="360"/>
+      </w:pPr>
+      <w:rPr>
+        <w:rFonts w:ascii="Wingdings" w:hAnsi="Wingdings" w:hint="default"/>
+        <w:sz w:val="20"/>
+      </w:rPr>
+    </w:lvl>
+  </w:abstractNum>
+  <w:abstractNum w:abstractNumId="6" w15:restartNumberingAfterBreak="0">
     <w:nsid w:val="76643758"/>
     <w:multiLevelType w:val="multilevel"/>
     <w:tmpl w:val="B552918E"/>
@@ -1077,7 +1815,7 @@
     </w:lvl>
   </w:abstractNum>
   <w:num w:numId="1" w16cid:durableId="413626571">
-    <w:abstractNumId w:val="1"/>
+    <w:abstractNumId w:val="2"/>
   </w:num>
   <w:num w:numId="2" w16cid:durableId="1079405618">
     <w:abstractNumId w:val="0"/>
@@ -1086,37 +1824,43 @@
     <w:abstractNumId w:val="0"/>
   </w:num>
   <w:num w:numId="4" w16cid:durableId="915625192">
-    <w:abstractNumId w:val="1"/>
+    <w:abstractNumId w:val="2"/>
   </w:num>
   <w:num w:numId="5" w16cid:durableId="338700193">
-    <w:abstractNumId w:val="1"/>
+    <w:abstractNumId w:val="2"/>
   </w:num>
   <w:num w:numId="6" w16cid:durableId="2068726324">
-    <w:abstractNumId w:val="1"/>
+    <w:abstractNumId w:val="2"/>
   </w:num>
   <w:num w:numId="7" w16cid:durableId="146481458">
-    <w:abstractNumId w:val="1"/>
+    <w:abstractNumId w:val="2"/>
   </w:num>
   <w:num w:numId="8" w16cid:durableId="1903054290">
-    <w:abstractNumId w:val="1"/>
+    <w:abstractNumId w:val="2"/>
   </w:num>
   <w:num w:numId="9" w16cid:durableId="1199272716">
-    <w:abstractNumId w:val="1"/>
+    <w:abstractNumId w:val="2"/>
   </w:num>
   <w:num w:numId="10" w16cid:durableId="968629490">
-    <w:abstractNumId w:val="1"/>
+    <w:abstractNumId w:val="2"/>
   </w:num>
   <w:num w:numId="11" w16cid:durableId="1937248024">
-    <w:abstractNumId w:val="1"/>
+    <w:abstractNumId w:val="2"/>
   </w:num>
   <w:num w:numId="12" w16cid:durableId="715355890">
+    <w:abstractNumId w:val="4"/>
+  </w:num>
+  <w:num w:numId="13" w16cid:durableId="1251961663">
+    <w:abstractNumId w:val="6"/>
+  </w:num>
+  <w:num w:numId="14" w16cid:durableId="1152915902">
     <w:abstractNumId w:val="3"/>
   </w:num>
-  <w:num w:numId="13" w16cid:durableId="1251961663">
-    <w:abstractNumId w:val="4"/>
+  <w:num w:numId="15" w16cid:durableId="612713733">
+    <w:abstractNumId w:val="5"/>
   </w:num>
-  <w:num w:numId="14" w16cid:durableId="1152915902">
-    <w:abstractNumId w:val="2"/>
+  <w:num w:numId="16" w16cid:durableId="734166265">
+    <w:abstractNumId w:val="1"/>
   </w:num>
 </w:numbering>
 </file>
@@ -2943,6 +3687,37 @@
       <w:szCs w:val="32"/>
     </w:rPr>
   </w:style>
+  <w:style w:type="paragraph" w:styleId="NormalWeb">
+    <w:name w:val="Normal (Web)"/>
+    <w:basedOn w:val="Normal"/>
+    <w:uiPriority w:val="99"/>
+    <w:semiHidden/>
+    <w:unhideWhenUsed/>
+    <w:rsid w:val="00417E21"/>
+    <w:pPr>
+      <w:spacing w:before="100" w:beforeAutospacing="1" w:after="100" w:afterAutospacing="1" w:line="240" w:lineRule="auto"/>
+    </w:pPr>
+    <w:rPr>
+      <w:rFonts w:ascii="Times New Roman" w:eastAsia="Times New Roman" w:hAnsi="Times New Roman" w:cs="Times New Roman"/>
+      <w:kern w:val="0"/>
+      <w:sz w:val="24"/>
+      <w:szCs w:val="24"/>
+      <w14:ligatures w14:val="none"/>
+    </w:rPr>
+  </w:style>
+  <w:style w:type="character" w:styleId="HTMLCode">
+    <w:name w:val="HTML Code"/>
+    <w:basedOn w:val="DefaultParagraphFont"/>
+    <w:uiPriority w:val="99"/>
+    <w:semiHidden/>
+    <w:unhideWhenUsed/>
+    <w:rsid w:val="00417E21"/>
+    <w:rPr>
+      <w:rFonts w:ascii="Courier New" w:eastAsia="Times New Roman" w:hAnsi="Courier New" w:cs="Courier New"/>
+      <w:sz w:val="20"/>
+      <w:szCs w:val="20"/>
+    </w:rPr>
+  </w:style>
 </w:styles>
 </file>
 

</xml_diff>